<commit_message>
Docs 3.2: Help center and changes since 3.1
- As-Built 3.2: sections 8.29-8.37 (focus 25 min, completed date and
  done check, single workspace owner and ownership transfer, project
  permission matrix, project hand-over, moving project data, AI
  citations / table repair / auto-resume / full comments, sticky group
  names, Help center, Vercel deploying master only, test catalogue).
- User guide 3.2 (Word): chapters 24 Help center, 25 project
  permissions / hand-over / data move, 26 other changes; FAQ rows.
- User guide PPTX 3.2: 8 new slides with screenshots (project
  permissions, hand-over x2, data move, ownership transfer, Help center,
  help search) and a summary table; part 8 renamed 'Settings & help'.
- Vibe Coding guide 1.3: infrastructure cost, verifying results, making
  AI answers checkable; checklist items.

Co-Authored-By: Claude Opus 5.5 <noreply@anthropic.com>
Claude-Session: https://claude.ai/code/session_01SUUhZJv1BWiVGjCMV3XTxQ
</commit_message>
<xml_diff>
--- a/docs/Huong-dan-Vibe-Coding-Claude-Code.docx
+++ b/docs/Huong-dan-Vibe-Coding-Claude-Code.docx
@@ -147,7 +147,7 @@
           <w:sz w:val="24"/>
           <w:szCs w:val="24"/>
         </w:rPr>
-        <w:t>Phiên bản 1.2 – Tháng 10/2026</w:t>
+        <w:t>Phiên bản 1.3 – Tháng 10/2026</w:t>
       </w:r>
       <w:r>
         <w:br w:type="page"/>
@@ -203,14 +203,14 @@
             </w:rPr>
             <w:fldChar w:fldCharType="separate"/>
           </w:r>
-          <w:hyperlink w:anchor="__RefHeading___Toc1525_740312040">
+          <w:hyperlink w:anchor="__RefHeading___Toc1587_2501354947">
             <w:r>
               <w:rPr>
                 <w:rStyle w:val="IndexLink"/>
               </w:rPr>
               <w:t>PHẦN I. TỔNG QUAN VỀ VIBE CODING</w:t>
               <w:tab/>
-              <w:t>3</w:t>
+              <w:t>4</w:t>
             </w:r>
           </w:hyperlink>
         </w:p>
@@ -223,14 +223,14 @@
             </w:tabs>
             <w:rPr/>
           </w:pPr>
-          <w:hyperlink w:anchor="__RefHeading___Toc1527_740312040">
+          <w:hyperlink w:anchor="__RefHeading___Toc1589_2501354947">
             <w:r>
               <w:rPr>
                 <w:rStyle w:val="IndexLink"/>
               </w:rPr>
               <w:t>1. Vibe coding là gì</w:t>
               <w:tab/>
-              <w:t>3</w:t>
+              <w:t>4</w:t>
             </w:r>
           </w:hyperlink>
         </w:p>
@@ -243,14 +243,14 @@
             </w:tabs>
             <w:rPr/>
           </w:pPr>
-          <w:hyperlink w:anchor="__RefHeading___Toc1529_740312040">
+          <w:hyperlink w:anchor="__RefHeading___Toc1591_2501354947">
             <w:r>
               <w:rPr>
                 <w:rStyle w:val="IndexLink"/>
               </w:rPr>
               <w:t>2. Phân vai giữa bạn và AI</w:t>
               <w:tab/>
-              <w:t>3</w:t>
+              <w:t>4</w:t>
             </w:r>
           </w:hyperlink>
         </w:p>
@@ -263,14 +263,14 @@
             </w:tabs>
             <w:rPr/>
           </w:pPr>
-          <w:hyperlink w:anchor="__RefHeading___Toc1531_740312040">
+          <w:hyperlink w:anchor="__RefHeading___Toc1593_2501354947">
             <w:r>
               <w:rPr>
                 <w:rStyle w:val="IndexLink"/>
               </w:rPr>
               <w:t>3. Claude Code và các cách sử dụng</w:t>
               <w:tab/>
-              <w:t>3</w:t>
+              <w:t>4</w:t>
             </w:r>
           </w:hyperlink>
         </w:p>
@@ -283,14 +283,14 @@
             </w:tabs>
             <w:rPr/>
           </w:pPr>
-          <w:hyperlink w:anchor="__RefHeading___Toc1533_740312040">
+          <w:hyperlink w:anchor="__RefHeading___Toc1595_2501354947">
             <w:r>
               <w:rPr>
                 <w:rStyle w:val="IndexLink"/>
               </w:rPr>
               <w:t>4. Yêu cầu tài khoản và máy tính</w:t>
               <w:tab/>
-              <w:t>4</w:t>
+              <w:t>5</w:t>
             </w:r>
           </w:hyperlink>
         </w:p>
@@ -303,14 +303,14 @@
             </w:tabs>
             <w:rPr/>
           </w:pPr>
-          <w:hyperlink w:anchor="__RefHeading___Toc1535_740312040">
+          <w:hyperlink w:anchor="__RefHeading___Toc1597_2501354947">
             <w:r>
               <w:rPr>
                 <w:rStyle w:val="IndexLink"/>
               </w:rPr>
               <w:t>5. Quy trình tổng thể 8 bước</w:t>
               <w:tab/>
-              <w:t>4</w:t>
+              <w:t>5</w:t>
             </w:r>
           </w:hyperlink>
         </w:p>
@@ -323,14 +323,14 @@
             </w:tabs>
             <w:rPr/>
           </w:pPr>
-          <w:hyperlink w:anchor="__RefHeading___Toc1537_740312040">
+          <w:hyperlink w:anchor="__RefHeading___Toc1599_2501354947">
             <w:r>
               <w:rPr>
                 <w:rStyle w:val="IndexLink"/>
               </w:rPr>
               <w:t>PHẦN II. CÀI ĐẶT VÀ ĐĂNG NHẬP CÔNG CỤ</w:t>
               <w:tab/>
-              <w:t>5</w:t>
+              <w:t>6</w:t>
             </w:r>
           </w:hyperlink>
         </w:p>
@@ -343,14 +343,14 @@
             </w:tabs>
             <w:rPr/>
           </w:pPr>
-          <w:hyperlink w:anchor="__RefHeading___Toc1539_740312040">
+          <w:hyperlink w:anchor="__RefHeading___Toc1601_2501354947">
             <w:r>
               <w:rPr>
                 <w:rStyle w:val="IndexLink"/>
               </w:rPr>
               <w:t>1. Tạo và đăng nhập tài khoản cần thiết</w:t>
               <w:tab/>
-              <w:t>5</w:t>
+              <w:t>6</w:t>
             </w:r>
           </w:hyperlink>
         </w:p>
@@ -363,14 +363,14 @@
             </w:tabs>
             <w:rPr/>
           </w:pPr>
-          <w:hyperlink w:anchor="__RefHeading___Toc1541_740312040">
+          <w:hyperlink w:anchor="__RefHeading___Toc1603_2501354947">
             <w:r>
               <w:rPr>
                 <w:rStyle w:val="IndexLink"/>
               </w:rPr>
               <w:t>2. Cách A – Dùng trên web (claude.ai/code), khuyên dùng cho người mới</w:t>
               <w:tab/>
-              <w:t>5</w:t>
+              <w:t>6</w:t>
             </w:r>
           </w:hyperlink>
         </w:p>
@@ -383,14 +383,14 @@
             </w:tabs>
             <w:rPr/>
           </w:pPr>
-          <w:hyperlink w:anchor="__RefHeading___Toc1543_740312040">
+          <w:hyperlink w:anchor="__RefHeading___Toc1605_2501354947">
             <w:r>
               <w:rPr>
                 <w:rStyle w:val="IndexLink"/>
               </w:rPr>
               <w:t>3. Cách B – Cài trên máy tính (terminal)</w:t>
               <w:tab/>
-              <w:t>6</w:t>
+              <w:t>7</w:t>
             </w:r>
           </w:hyperlink>
         </w:p>
@@ -403,14 +403,14 @@
             </w:tabs>
             <w:rPr/>
           </w:pPr>
-          <w:hyperlink w:anchor="__RefHeading___Toc1545_740312040">
+          <w:hyperlink w:anchor="__RefHeading___Toc1607_2501354947">
             <w:r>
               <w:rPr>
                 <w:rStyle w:val="IndexLink"/>
               </w:rPr>
               <w:t>4. Đăng nhập Claude Code trên terminal</w:t>
               <w:tab/>
-              <w:t>7</w:t>
+              <w:t>8</w:t>
             </w:r>
           </w:hyperlink>
         </w:p>
@@ -423,14 +423,14 @@
             </w:tabs>
             <w:rPr/>
           </w:pPr>
-          <w:hyperlink w:anchor="__RefHeading___Toc1547_740312040">
+          <w:hyperlink w:anchor="__RefHeading___Toc1609_2501354947">
             <w:r>
               <w:rPr>
                 <w:rStyle w:val="IndexLink"/>
               </w:rPr>
               <w:t>5. Các lệnh hữu ích</w:t>
               <w:tab/>
-              <w:t>8</w:t>
+              <w:t>9</w:t>
             </w:r>
           </w:hyperlink>
         </w:p>
@@ -443,14 +443,14 @@
             </w:tabs>
             <w:rPr/>
           </w:pPr>
-          <w:hyperlink w:anchor="__RefHeading___Toc1549_740312040">
+          <w:hyperlink w:anchor="__RefHeading___Toc1611_2501354947">
             <w:r>
               <w:rPr>
                 <w:rStyle w:val="IndexLink"/>
               </w:rPr>
               <w:t>PHẦN III. QUY TRÌNH VIBE CODING 8 BƯỚC</w:t>
               <w:tab/>
-              <w:t>9</w:t>
+              <w:t>10</w:t>
             </w:r>
           </w:hyperlink>
         </w:p>
@@ -463,14 +463,14 @@
             </w:tabs>
             <w:rPr/>
           </w:pPr>
-          <w:hyperlink w:anchor="__RefHeading___Toc1551_740312040">
+          <w:hyperlink w:anchor="__RefHeading___Toc1613_2501354947">
             <w:r>
               <w:rPr>
                 <w:rStyle w:val="IndexLink"/>
               </w:rPr>
               <w:t>1. Bước 1 – Xác định ý tưởng và phạm vi</w:t>
               <w:tab/>
-              <w:t>9</w:t>
+              <w:t>10</w:t>
             </w:r>
           </w:hyperlink>
         </w:p>
@@ -483,14 +483,14 @@
             </w:tabs>
             <w:rPr/>
           </w:pPr>
-          <w:hyperlink w:anchor="__RefHeading___Toc1553_740312040">
+          <w:hyperlink w:anchor="__RefHeading___Toc1615_2501354947">
             <w:r>
               <w:rPr>
                 <w:rStyle w:val="IndexLink"/>
               </w:rPr>
               <w:t>2. Bước 2 – Chọn công nghệ và chuẩn bị</w:t>
               <w:tab/>
-              <w:t>9</w:t>
+              <w:t>10</w:t>
             </w:r>
           </w:hyperlink>
         </w:p>
@@ -503,14 +503,14 @@
             </w:tabs>
             <w:rPr/>
           </w:pPr>
-          <w:hyperlink w:anchor="__RefHeading___Toc1555_740312040">
+          <w:hyperlink w:anchor="__RefHeading___Toc1617_2501354947">
             <w:r>
               <w:rPr>
                 <w:rStyle w:val="IndexLink"/>
               </w:rPr>
               <w:t>3. Bước 3 – Viết đặc tả và file CLAUDE.md</w:t>
               <w:tab/>
-              <w:t>10</w:t>
+              <w:t>11</w:t>
             </w:r>
           </w:hyperlink>
         </w:p>
@@ -523,14 +523,14 @@
             </w:tabs>
             <w:rPr/>
           </w:pPr>
-          <w:hyperlink w:anchor="__RefHeading___Toc1557_740312040">
+          <w:hyperlink w:anchor="__RefHeading___Toc1619_2501354947">
             <w:r>
               <w:rPr>
                 <w:rStyle w:val="IndexLink"/>
               </w:rPr>
               <w:t>4. Bước 4 – Xây dựng theo vòng lặp nhỏ</w:t>
               <w:tab/>
-              <w:t>10</w:t>
+              <w:t>11</w:t>
             </w:r>
           </w:hyperlink>
         </w:p>
@@ -543,14 +543,14 @@
             </w:tabs>
             <w:rPr/>
           </w:pPr>
-          <w:hyperlink w:anchor="__RefHeading___Toc1559_740312040">
+          <w:hyperlink w:anchor="__RefHeading___Toc1621_2501354947">
             <w:r>
               <w:rPr>
                 <w:rStyle w:val="IndexLink"/>
               </w:rPr>
               <w:t>5. Bước 5 – Kiểm thử trước khi đưa lên</w:t>
               <w:tab/>
-              <w:t>11</w:t>
+              <w:t>12</w:t>
             </w:r>
           </w:hyperlink>
         </w:p>
@@ -563,14 +563,14 @@
             </w:tabs>
             <w:rPr/>
           </w:pPr>
-          <w:hyperlink w:anchor="__RefHeading___Toc1561_740312040">
+          <w:hyperlink w:anchor="__RefHeading___Toc1623_2501354947">
             <w:r>
               <w:rPr>
                 <w:rStyle w:val="IndexLink"/>
               </w:rPr>
               <w:t>6. Bước 6 – Rà soát và bảo mật</w:t>
               <w:tab/>
-              <w:t>11</w:t>
+              <w:t>12</w:t>
             </w:r>
           </w:hyperlink>
         </w:p>
@@ -583,14 +583,14 @@
             </w:tabs>
             <w:rPr/>
           </w:pPr>
-          <w:hyperlink w:anchor="__RefHeading___Toc1563_740312040">
+          <w:hyperlink w:anchor="__RefHeading___Toc1625_2501354947">
             <w:r>
               <w:rPr>
                 <w:rStyle w:val="IndexLink"/>
               </w:rPr>
               <w:t>7. Bước 7 – Commit, Pull Request và Merge</w:t>
               <w:tab/>
-              <w:t>12</w:t>
+              <w:t>13</w:t>
             </w:r>
           </w:hyperlink>
         </w:p>
@@ -603,14 +603,14 @@
             </w:tabs>
             <w:rPr/>
           </w:pPr>
-          <w:hyperlink w:anchor="__RefHeading___Toc1565_740312040">
+          <w:hyperlink w:anchor="__RefHeading___Toc1627_2501354947">
             <w:r>
               <w:rPr>
                 <w:rStyle w:val="IndexLink"/>
               </w:rPr>
               <w:t>8. Bước 8 – Triển khai và vận hành</w:t>
               <w:tab/>
-              <w:t>12</w:t>
+              <w:t>13</w:t>
             </w:r>
           </w:hyperlink>
         </w:p>
@@ -623,14 +623,14 @@
             </w:tabs>
             <w:rPr/>
           </w:pPr>
-          <w:hyperlink w:anchor="__RefHeading___Toc1567_740312040">
+          <w:hyperlink w:anchor="__RefHeading___Toc1629_2501354947">
             <w:r>
               <w:rPr>
                 <w:rStyle w:val="IndexLink"/>
               </w:rPr>
               <w:t>PHẦN IV. KỸ THUẬT VIẾT YÊU CẦU (PROMPT) HIỆU QUẢ</w:t>
               <w:tab/>
-              <w:t>13</w:t>
+              <w:t>14</w:t>
             </w:r>
           </w:hyperlink>
         </w:p>
@@ -643,14 +643,14 @@
             </w:tabs>
             <w:rPr/>
           </w:pPr>
-          <w:hyperlink w:anchor="__RefHeading___Toc1569_740312040">
+          <w:hyperlink w:anchor="__RefHeading___Toc1631_2501354947">
             <w:r>
               <w:rPr>
                 <w:rStyle w:val="IndexLink"/>
               </w:rPr>
               <w:t>1. Cấu trúc yêu cầu 5 phần</w:t>
               <w:tab/>
-              <w:t>13</w:t>
+              <w:t>14</w:t>
             </w:r>
           </w:hyperlink>
         </w:p>
@@ -663,14 +663,14 @@
             </w:tabs>
             <w:rPr/>
           </w:pPr>
-          <w:hyperlink w:anchor="__RefHeading___Toc1571_740312040">
+          <w:hyperlink w:anchor="__RefHeading___Toc1633_2501354947">
             <w:r>
               <w:rPr>
                 <w:rStyle w:val="IndexLink"/>
               </w:rPr>
               <w:t>2. Mẫu yêu cầu dùng ngay</w:t>
               <w:tab/>
-              <w:t>13</w:t>
+              <w:t>14</w:t>
             </w:r>
           </w:hyperlink>
         </w:p>
@@ -683,14 +683,14 @@
             </w:tabs>
             <w:rPr/>
           </w:pPr>
-          <w:hyperlink w:anchor="__RefHeading___Toc1573_740312040">
+          <w:hyperlink w:anchor="__RefHeading___Toc1635_2501354947">
             <w:r>
               <w:rPr>
                 <w:rStyle w:val="IndexLink"/>
               </w:rPr>
               <w:t>3. Yêu cầu chưa tốt và cách viết lại</w:t>
               <w:tab/>
-              <w:t>14</w:t>
+              <w:t>15</w:t>
             </w:r>
           </w:hyperlink>
         </w:p>
@@ -703,14 +703,14 @@
             </w:tabs>
             <w:rPr/>
           </w:pPr>
-          <w:hyperlink w:anchor="__RefHeading___Toc1575_740312040">
+          <w:hyperlink w:anchor="__RefHeading___Toc1637_2501354947">
             <w:r>
               <w:rPr>
                 <w:rStyle w:val="IndexLink"/>
               </w:rPr>
               <w:t>4. Mẹo làm việc với Claude Code</w:t>
               <w:tab/>
-              <w:t>14</w:t>
+              <w:t>15</w:t>
             </w:r>
           </w:hyperlink>
         </w:p>
@@ -723,14 +723,14 @@
             </w:tabs>
             <w:rPr/>
           </w:pPr>
-          <w:hyperlink w:anchor="__RefHeading___Toc1577_740312040">
+          <w:hyperlink w:anchor="__RefHeading___Toc1639_2501354947">
             <w:r>
               <w:rPr>
                 <w:rStyle w:val="IndexLink"/>
               </w:rPr>
               <w:t>PHẦN V. VIẾT HƯỚNG DẪN ĐĂNG NHẬP CHO NGƯỜI DÙNG APP</w:t>
               <w:tab/>
-              <w:t>15</w:t>
+              <w:t>16</w:t>
             </w:r>
           </w:hyperlink>
         </w:p>
@@ -743,14 +743,14 @@
             </w:tabs>
             <w:rPr/>
           </w:pPr>
-          <w:hyperlink w:anchor="__RefHeading___Toc1579_740312040">
+          <w:hyperlink w:anchor="__RefHeading___Toc1641_2501354947">
             <w:r>
               <w:rPr>
                 <w:rStyle w:val="IndexLink"/>
               </w:rPr>
               <w:t>1. Yêu cầu Claude tạo tài liệu hướng dẫn</w:t>
               <w:tab/>
-              <w:t>15</w:t>
+              <w:t>16</w:t>
             </w:r>
           </w:hyperlink>
         </w:p>
@@ -763,14 +763,14 @@
             </w:tabs>
             <w:rPr/>
           </w:pPr>
-          <w:hyperlink w:anchor="__RefHeading___Toc1581_740312040">
+          <w:hyperlink w:anchor="__RefHeading___Toc1643_2501354947">
             <w:r>
               <w:rPr>
                 <w:rStyle w:val="IndexLink"/>
               </w:rPr>
               <w:t>2. Mẫu tham khảo: hướng dẫn đăng nhập một ứng dụng</w:t>
               <w:tab/>
-              <w:t>15</w:t>
+              <w:t>16</w:t>
             </w:r>
           </w:hyperlink>
         </w:p>
@@ -783,14 +783,14 @@
             </w:tabs>
             <w:rPr/>
           </w:pPr>
-          <w:hyperlink w:anchor="__RefHeading___Toc1583_740312040">
+          <w:hyperlink w:anchor="__RefHeading___Toc1645_2501354947">
             <w:r>
               <w:rPr>
                 <w:rStyle w:val="IndexLink"/>
               </w:rPr>
               <w:t>PHẦN VI. LỖI THƯỜNG GẶP VÀ CÁCH PHÒNG TRÁNH</w:t>
               <w:tab/>
-              <w:t>19</w:t>
+              <w:t>20</w:t>
             </w:r>
           </w:hyperlink>
         </w:p>
@@ -803,14 +803,14 @@
             </w:tabs>
             <w:rPr/>
           </w:pPr>
-          <w:hyperlink w:anchor="__RefHeading___Toc1585_740312040">
+          <w:hyperlink w:anchor="__RefHeading___Toc1647_2501354947">
             <w:r>
               <w:rPr>
                 <w:rStyle w:val="IndexLink"/>
               </w:rPr>
               <w:t>1. Nguyên tắc an toàn</w:t>
               <w:tab/>
-              <w:t>20</w:t>
+              <w:t>21</w:t>
             </w:r>
           </w:hyperlink>
         </w:p>
@@ -823,14 +823,14 @@
             </w:tabs>
             <w:rPr/>
           </w:pPr>
-          <w:hyperlink w:anchor="__RefHeading___Toc1587_740312040">
+          <w:hyperlink w:anchor="__RefHeading___Toc1649_2501354947">
             <w:r>
               <w:rPr>
                 <w:rStyle w:val="IndexLink"/>
               </w:rPr>
               <w:t>2. Nguyên tắc làm việc hiệu quả</w:t>
               <w:tab/>
-              <w:t>20</w:t>
+              <w:t>21</w:t>
             </w:r>
           </w:hyperlink>
         </w:p>
@@ -843,14 +843,14 @@
             </w:tabs>
             <w:rPr/>
           </w:pPr>
-          <w:hyperlink w:anchor="__RefHeading___Toc1589_740312040">
+          <w:hyperlink w:anchor="__RefHeading___Toc1651_2501354947">
             <w:r>
               <w:rPr>
                 <w:rStyle w:val="IndexLink"/>
               </w:rPr>
               <w:t>3. Tích hợp dịch vụ ngoài: email, đăng nhập, AI</w:t>
               <w:tab/>
-              <w:t>20</w:t>
+              <w:t>21</w:t>
             </w:r>
           </w:hyperlink>
         </w:p>
@@ -863,14 +863,14 @@
             </w:tabs>
             <w:rPr/>
           </w:pPr>
-          <w:hyperlink w:anchor="__RefHeading___Toc1591_740312040">
+          <w:hyperlink w:anchor="__RefHeading___Toc1653_2501354947">
             <w:r>
               <w:rPr>
                 <w:rStyle w:val="IndexLink"/>
               </w:rPr>
               <w:t>4. Báo lỗi và yêu cầu tính năng hiệu quả</w:t>
               <w:tab/>
-              <w:t>21</w:t>
+              <w:t>22</w:t>
             </w:r>
           </w:hyperlink>
         </w:p>
@@ -883,14 +883,14 @@
             </w:tabs>
             <w:rPr/>
           </w:pPr>
-          <w:hyperlink w:anchor="__RefHeading___Toc1593_740312040">
+          <w:hyperlink w:anchor="__RefHeading___Toc1655_2501354947">
             <w:r>
               <w:rPr>
                 <w:rStyle w:val="IndexLink"/>
               </w:rPr>
               <w:t>5. Giữ tài liệu luôn khớp với app</w:t>
               <w:tab/>
-              <w:t>21</w:t>
+              <w:t>22</w:t>
             </w:r>
           </w:hyperlink>
         </w:p>
@@ -903,14 +903,74 @@
             </w:tabs>
             <w:rPr/>
           </w:pPr>
-          <w:hyperlink w:anchor="__RefHeading___Toc1595_740312040">
+          <w:hyperlink w:anchor="__RefHeading___Toc1657_2501354947">
             <w:r>
               <w:rPr>
                 <w:rStyle w:val="IndexLink"/>
               </w:rPr>
               <w:t>6. Làm việc với AI review (Codex) và PR</w:t>
               <w:tab/>
-              <w:t>22</w:t>
+              <w:t>23</w:t>
+            </w:r>
+          </w:hyperlink>
+        </w:p>
+        <w:p>
+          <w:pPr>
+            <w:pStyle w:val="TOC2"/>
+            <w:tabs>
+              <w:tab w:val="clear" w:pos="8788"/>
+              <w:tab w:val="right" w:pos="9070" w:leader="dot"/>
+            </w:tabs>
+            <w:rPr/>
+          </w:pPr>
+          <w:hyperlink w:anchor="__RefHeading___Toc1659_2501354947">
+            <w:r>
+              <w:rPr>
+                <w:rStyle w:val="IndexLink"/>
+              </w:rPr>
+              <w:t>7. Kiểm soát chi phí hạ tầng</w:t>
+              <w:tab/>
+              <w:t>23</w:t>
+            </w:r>
+          </w:hyperlink>
+        </w:p>
+        <w:p>
+          <w:pPr>
+            <w:pStyle w:val="TOC2"/>
+            <w:tabs>
+              <w:tab w:val="clear" w:pos="8788"/>
+              <w:tab w:val="right" w:pos="9070" w:leader="dot"/>
+            </w:tabs>
+            <w:rPr/>
+          </w:pPr>
+          <w:hyperlink w:anchor="__RefHeading___Toc1661_2501354947">
+            <w:r>
+              <w:rPr>
+                <w:rStyle w:val="IndexLink"/>
+              </w:rPr>
+              <w:t>8. Kiểm chứng kết quả, không chỉ đọc báo cáo</w:t>
+              <w:tab/>
+              <w:t>23</w:t>
+            </w:r>
+          </w:hyperlink>
+        </w:p>
+        <w:p>
+          <w:pPr>
+            <w:pStyle w:val="TOC2"/>
+            <w:tabs>
+              <w:tab w:val="clear" w:pos="8788"/>
+              <w:tab w:val="right" w:pos="9070" w:leader="dot"/>
+            </w:tabs>
+            <w:rPr/>
+          </w:pPr>
+          <w:hyperlink w:anchor="__RefHeading___Toc1663_2501354947">
+            <w:r>
+              <w:rPr>
+                <w:rStyle w:val="IndexLink"/>
+              </w:rPr>
+              <w:t>9. Làm cho câu trả lời AI kiểm chứng được</w:t>
+              <w:tab/>
+              <w:t>24</w:t>
             </w:r>
           </w:hyperlink>
         </w:p>
@@ -923,14 +983,14 @@
             </w:tabs>
             <w:rPr/>
           </w:pPr>
-          <w:hyperlink w:anchor="__RefHeading___Toc1597_740312040">
+          <w:hyperlink w:anchor="__RefHeading___Toc1665_2501354947">
             <w:r>
               <w:rPr>
                 <w:rStyle w:val="IndexLink"/>
               </w:rPr>
               <w:t>PHẦN VII. PHỤ LỤC</w:t>
               <w:tab/>
-              <w:t>23</w:t>
+              <w:t>25</w:t>
             </w:r>
           </w:hyperlink>
         </w:p>
@@ -943,14 +1003,14 @@
             </w:tabs>
             <w:rPr/>
           </w:pPr>
-          <w:hyperlink w:anchor="__RefHeading___Toc1599_740312040">
+          <w:hyperlink w:anchor="__RefHeading___Toc1667_2501354947">
             <w:r>
               <w:rPr>
                 <w:rStyle w:val="IndexLink"/>
               </w:rPr>
               <w:t>1. Danh sách kiểm tra trước khi merge</w:t>
               <w:tab/>
-              <w:t>23</w:t>
+              <w:t>25</w:t>
             </w:r>
           </w:hyperlink>
         </w:p>
@@ -963,14 +1023,14 @@
             </w:tabs>
             <w:rPr/>
           </w:pPr>
-          <w:hyperlink w:anchor="__RefHeading___Toc1601_740312040">
+          <w:hyperlink w:anchor="__RefHeading___Toc1669_2501354947">
             <w:r>
               <w:rPr>
                 <w:rStyle w:val="IndexLink"/>
               </w:rPr>
               <w:t>2. Lệnh Git thường gặp</w:t>
               <w:tab/>
-              <w:t>23</w:t>
+              <w:t>25</w:t>
             </w:r>
           </w:hyperlink>
         </w:p>
@@ -983,14 +1043,14 @@
             </w:tabs>
             <w:rPr/>
           </w:pPr>
-          <w:hyperlink w:anchor="__RefHeading___Toc1603_740312040">
+          <w:hyperlink w:anchor="__RefHeading___Toc1671_2501354947">
             <w:r>
               <w:rPr>
                 <w:rStyle w:val="IndexLink"/>
               </w:rPr>
               <w:t>3. Thuật ngữ</w:t>
               <w:tab/>
-              <w:t>23</w:t>
+              <w:t>25</w:t>
             </w:r>
           </w:hyperlink>
         </w:p>
@@ -1003,14 +1063,14 @@
             </w:tabs>
             <w:rPr/>
           </w:pPr>
-          <w:hyperlink w:anchor="__RefHeading___Toc1605_740312040">
+          <w:hyperlink w:anchor="__RefHeading___Toc1673_2501354947">
             <w:r>
               <w:rPr>
                 <w:rStyle w:val="IndexLink"/>
               </w:rPr>
               <w:t>4. Nguồn tham khảo chính thức</w:t>
               <w:tab/>
-              <w:t>24</w:t>
+              <w:t>26</w:t>
             </w:r>
           </w:hyperlink>
           <w:r>
@@ -1111,7 +1171,7 @@
         <w:spacing w:before="240" w:after="200"/>
         <w:rPr/>
       </w:pPr>
-      <w:bookmarkStart w:id="0" w:name="__RefHeading___Toc1525_740312040"/>
+      <w:bookmarkStart w:id="0" w:name="__RefHeading___Toc1587_2501354947"/>
       <w:bookmarkEnd w:id="0"/>
       <w:r>
         <w:rPr>
@@ -1131,7 +1191,7 @@
         <w:spacing w:before="280" w:after="140"/>
         <w:rPr/>
       </w:pPr>
-      <w:bookmarkStart w:id="1" w:name="__RefHeading___Toc1527_740312040"/>
+      <w:bookmarkStart w:id="1" w:name="__RefHeading___Toc1589_2501354947"/>
       <w:bookmarkEnd w:id="1"/>
       <w:r>
         <w:rPr>
@@ -1247,7 +1307,7 @@
         <w:spacing w:before="280" w:after="140"/>
         <w:rPr/>
       </w:pPr>
-      <w:bookmarkStart w:id="2" w:name="__RefHeading___Toc1529_740312040"/>
+      <w:bookmarkStart w:id="2" w:name="__RefHeading___Toc1591_2501354947"/>
       <w:bookmarkEnd w:id="2"/>
       <w:r>
         <w:rPr>
@@ -1736,7 +1796,7 @@
         <w:spacing w:before="280" w:after="140"/>
         <w:rPr/>
       </w:pPr>
-      <w:bookmarkStart w:id="3" w:name="__RefHeading___Toc1531_740312040"/>
+      <w:bookmarkStart w:id="3" w:name="__RefHeading___Toc1593_2501354947"/>
       <w:bookmarkEnd w:id="3"/>
       <w:r>
         <w:rPr>
@@ -2404,7 +2464,7 @@
         <w:spacing w:before="280" w:after="140"/>
         <w:rPr/>
       </w:pPr>
-      <w:bookmarkStart w:id="4" w:name="__RefHeading___Toc1533_740312040"/>
+      <w:bookmarkStart w:id="4" w:name="__RefHeading___Toc1595_2501354947"/>
       <w:bookmarkEnd w:id="4"/>
       <w:r>
         <w:rPr>
@@ -2618,7 +2678,7 @@
         <w:spacing w:before="280" w:after="140"/>
         <w:rPr/>
       </w:pPr>
-      <w:bookmarkStart w:id="5" w:name="__RefHeading___Toc1535_740312040"/>
+      <w:bookmarkStart w:id="5" w:name="__RefHeading___Toc1597_2501354947"/>
       <w:bookmarkEnd w:id="5"/>
       <w:r>
         <w:rPr>
@@ -2724,7 +2784,7 @@
         <w:spacing w:before="240" w:after="200"/>
         <w:rPr/>
       </w:pPr>
-      <w:bookmarkStart w:id="6" w:name="__RefHeading___Toc1537_740312040"/>
+      <w:bookmarkStart w:id="6" w:name="__RefHeading___Toc1599_2501354947"/>
       <w:bookmarkEnd w:id="6"/>
       <w:r>
         <w:rPr>
@@ -2744,7 +2804,7 @@
         <w:spacing w:before="280" w:after="140"/>
         <w:rPr/>
       </w:pPr>
-      <w:bookmarkStart w:id="7" w:name="__RefHeading___Toc1539_740312040"/>
+      <w:bookmarkStart w:id="7" w:name="__RefHeading___Toc1601_2501354947"/>
       <w:bookmarkEnd w:id="7"/>
       <w:r>
         <w:rPr>
@@ -2996,7 +3056,7 @@
         <w:spacing w:before="280" w:after="140"/>
         <w:rPr/>
       </w:pPr>
-      <w:bookmarkStart w:id="8" w:name="__RefHeading___Toc1541_740312040"/>
+      <w:bookmarkStart w:id="8" w:name="__RefHeading___Toc1603_2501354947"/>
       <w:bookmarkEnd w:id="8"/>
       <w:r>
         <w:rPr>
@@ -3435,7 +3495,7 @@
         <w:spacing w:before="280" w:after="140"/>
         <w:rPr/>
       </w:pPr>
-      <w:bookmarkStart w:id="9" w:name="__RefHeading___Toc1543_740312040"/>
+      <w:bookmarkStart w:id="9" w:name="__RefHeading___Toc1605_2501354947"/>
       <w:bookmarkEnd w:id="9"/>
       <w:r>
         <w:rPr>
@@ -4043,7 +4103,7 @@
         <w:spacing w:before="280" w:after="140"/>
         <w:rPr/>
       </w:pPr>
-      <w:bookmarkStart w:id="10" w:name="__RefHeading___Toc1545_740312040"/>
+      <w:bookmarkStart w:id="10" w:name="__RefHeading___Toc1607_2501354947"/>
       <w:bookmarkEnd w:id="10"/>
       <w:r>
         <w:rPr>
@@ -4498,7 +4558,7 @@
         <w:spacing w:before="280" w:after="140"/>
         <w:rPr/>
       </w:pPr>
-      <w:bookmarkStart w:id="11" w:name="__RefHeading___Toc1547_740312040"/>
+      <w:bookmarkStart w:id="11" w:name="__RefHeading___Toc1609_2501354947"/>
       <w:bookmarkEnd w:id="11"/>
       <w:r>
         <w:rPr>
@@ -5065,7 +5125,7 @@
       <w:r>
         <w:br w:type="page"/>
       </w:r>
-      <w:bookmarkStart w:id="12" w:name="__RefHeading___Toc1549_740312040"/>
+      <w:bookmarkStart w:id="12" w:name="__RefHeading___Toc1611_2501354947"/>
       <w:bookmarkEnd w:id="12"/>
       <w:r>
         <w:rPr>
@@ -5085,7 +5145,7 @@
         <w:spacing w:before="280" w:after="140"/>
         <w:rPr/>
       </w:pPr>
-      <w:bookmarkStart w:id="13" w:name="__RefHeading___Toc1551_740312040"/>
+      <w:bookmarkStart w:id="13" w:name="__RefHeading___Toc1613_2501354947"/>
       <w:bookmarkEnd w:id="13"/>
       <w:r>
         <w:rPr>
@@ -5677,7 +5737,7 @@
         <w:spacing w:before="280" w:after="140"/>
         <w:rPr/>
       </w:pPr>
-      <w:bookmarkStart w:id="14" w:name="__RefHeading___Toc1553_740312040"/>
+      <w:bookmarkStart w:id="14" w:name="__RefHeading___Toc1615_2501354947"/>
       <w:bookmarkEnd w:id="14"/>
       <w:r>
         <w:rPr>
@@ -6381,7 +6441,7 @@
         <w:spacing w:before="280" w:after="140"/>
         <w:rPr/>
       </w:pPr>
-      <w:bookmarkStart w:id="15" w:name="__RefHeading___Toc1555_740312040"/>
+      <w:bookmarkStart w:id="15" w:name="__RefHeading___Toc1617_2501354947"/>
       <w:bookmarkEnd w:id="15"/>
       <w:r>
         <w:rPr>
@@ -6884,7 +6944,7 @@
         <w:spacing w:before="280" w:after="140"/>
         <w:rPr/>
       </w:pPr>
-      <w:bookmarkStart w:id="16" w:name="__RefHeading___Toc1557_740312040"/>
+      <w:bookmarkStart w:id="16" w:name="__RefHeading___Toc1619_2501354947"/>
       <w:bookmarkEnd w:id="16"/>
       <w:r>
         <w:rPr>
@@ -7134,7 +7194,7 @@
         <w:spacing w:before="280" w:after="140"/>
         <w:rPr/>
       </w:pPr>
-      <w:bookmarkStart w:id="17" w:name="__RefHeading___Toc1559_740312040"/>
+      <w:bookmarkStart w:id="17" w:name="__RefHeading___Toc1621_2501354947"/>
       <w:bookmarkEnd w:id="17"/>
       <w:r>
         <w:rPr>
@@ -7885,7 +7945,7 @@
         <w:spacing w:before="280" w:after="140"/>
         <w:rPr/>
       </w:pPr>
-      <w:bookmarkStart w:id="18" w:name="__RefHeading___Toc1561_740312040"/>
+      <w:bookmarkStart w:id="18" w:name="__RefHeading___Toc1623_2501354947"/>
       <w:bookmarkEnd w:id="18"/>
       <w:r>
         <w:rPr>
@@ -8172,7 +8232,7 @@
         <w:spacing w:before="280" w:after="140"/>
         <w:rPr/>
       </w:pPr>
-      <w:bookmarkStart w:id="19" w:name="__RefHeading___Toc1563_740312040"/>
+      <w:bookmarkStart w:id="19" w:name="__RefHeading___Toc1625_2501354947"/>
       <w:bookmarkEnd w:id="19"/>
       <w:r>
         <w:rPr>
@@ -8509,7 +8569,7 @@
         <w:spacing w:before="280" w:after="140"/>
         <w:rPr/>
       </w:pPr>
-      <w:bookmarkStart w:id="20" w:name="__RefHeading___Toc1565_740312040"/>
+      <w:bookmarkStart w:id="20" w:name="__RefHeading___Toc1627_2501354947"/>
       <w:bookmarkEnd w:id="20"/>
       <w:r>
         <w:rPr>
@@ -8694,7 +8754,7 @@
         <w:spacing w:before="240" w:after="200"/>
         <w:rPr/>
       </w:pPr>
-      <w:bookmarkStart w:id="21" w:name="__RefHeading___Toc1567_740312040"/>
+      <w:bookmarkStart w:id="21" w:name="__RefHeading___Toc1629_2501354947"/>
       <w:bookmarkEnd w:id="21"/>
       <w:r>
         <w:rPr>
@@ -8714,7 +8774,7 @@
         <w:spacing w:before="280" w:after="140"/>
         <w:rPr/>
       </w:pPr>
-      <w:bookmarkStart w:id="22" w:name="__RefHeading___Toc1569_740312040"/>
+      <w:bookmarkStart w:id="22" w:name="__RefHeading___Toc1631_2501354947"/>
       <w:bookmarkEnd w:id="22"/>
       <w:r>
         <w:rPr>
@@ -9306,7 +9366,7 @@
         <w:spacing w:before="280" w:after="140"/>
         <w:rPr/>
       </w:pPr>
-      <w:bookmarkStart w:id="23" w:name="__RefHeading___Toc1571_740312040"/>
+      <w:bookmarkStart w:id="23" w:name="__RefHeading___Toc1633_2501354947"/>
       <w:bookmarkEnd w:id="23"/>
       <w:r>
         <w:rPr>
@@ -9758,7 +9818,7 @@
         <w:spacing w:before="280" w:after="140"/>
         <w:rPr/>
       </w:pPr>
-      <w:bookmarkStart w:id="24" w:name="__RefHeading___Toc1573_740312040"/>
+      <w:bookmarkStart w:id="24" w:name="__RefHeading___Toc1635_2501354947"/>
       <w:bookmarkEnd w:id="24"/>
       <w:r>
         <w:rPr>
@@ -10105,7 +10165,7 @@
         <w:spacing w:before="280" w:after="140"/>
         <w:rPr/>
       </w:pPr>
-      <w:bookmarkStart w:id="25" w:name="__RefHeading___Toc1575_740312040"/>
+      <w:bookmarkStart w:id="25" w:name="__RefHeading___Toc1637_2501354947"/>
       <w:bookmarkEnd w:id="25"/>
       <w:r>
         <w:rPr>
@@ -10318,7 +10378,7 @@
         <w:spacing w:before="240" w:after="200"/>
         <w:rPr/>
       </w:pPr>
-      <w:bookmarkStart w:id="26" w:name="__RefHeading___Toc1577_740312040"/>
+      <w:bookmarkStart w:id="26" w:name="__RefHeading___Toc1639_2501354947"/>
       <w:bookmarkEnd w:id="26"/>
       <w:r>
         <w:rPr>
@@ -10372,7 +10432,7 @@
         <w:spacing w:before="280" w:after="140"/>
         <w:rPr/>
       </w:pPr>
-      <w:bookmarkStart w:id="27" w:name="__RefHeading___Toc1579_740312040"/>
+      <w:bookmarkStart w:id="27" w:name="__RefHeading___Toc1641_2501354947"/>
       <w:bookmarkEnd w:id="27"/>
       <w:r>
         <w:rPr>
@@ -10548,7 +10608,7 @@
         <w:spacing w:before="280" w:after="140"/>
         <w:rPr/>
       </w:pPr>
-      <w:bookmarkStart w:id="28" w:name="__RefHeading___Toc1581_740312040"/>
+      <w:bookmarkStart w:id="28" w:name="__RefHeading___Toc1643_2501354947"/>
       <w:bookmarkEnd w:id="28"/>
       <w:r>
         <w:rPr>
@@ -12223,7 +12283,7 @@
         <w:spacing w:before="240" w:after="200"/>
         <w:rPr/>
       </w:pPr>
-      <w:bookmarkStart w:id="29" w:name="__RefHeading___Toc1583_740312040"/>
+      <w:bookmarkStart w:id="29" w:name="__RefHeading___Toc1645_2501354947"/>
       <w:bookmarkEnd w:id="29"/>
       <w:r>
         <w:rPr>
@@ -13959,7 +14019,7 @@
         <w:spacing w:before="280" w:after="140"/>
         <w:rPr/>
       </w:pPr>
-      <w:bookmarkStart w:id="30" w:name="__RefHeading___Toc1585_740312040"/>
+      <w:bookmarkStart w:id="30" w:name="__RefHeading___Toc1647_2501354947"/>
       <w:bookmarkEnd w:id="30"/>
       <w:r>
         <w:rPr>
@@ -14073,7 +14133,7 @@
         <w:spacing w:before="280" w:after="140"/>
         <w:rPr/>
       </w:pPr>
-      <w:bookmarkStart w:id="31" w:name="__RefHeading___Toc1587_740312040"/>
+      <w:bookmarkStart w:id="31" w:name="__RefHeading___Toc1649_2501354947"/>
       <w:bookmarkEnd w:id="31"/>
       <w:r>
         <w:rPr>
@@ -14169,7 +14229,7 @@
         <w:spacing w:before="280" w:after="140"/>
         <w:rPr/>
       </w:pPr>
-      <w:bookmarkStart w:id="32" w:name="__RefHeading___Toc1589_740312040"/>
+      <w:bookmarkStart w:id="32" w:name="__RefHeading___Toc1651_2501354947"/>
       <w:bookmarkEnd w:id="32"/>
       <w:r>
         <w:rPr>
@@ -14840,7 +14900,7 @@
         <w:spacing w:before="280" w:after="140"/>
         <w:rPr/>
       </w:pPr>
-      <w:bookmarkStart w:id="33" w:name="__RefHeading___Toc1591_740312040"/>
+      <w:bookmarkStart w:id="33" w:name="__RefHeading___Toc1653_2501354947"/>
       <w:bookmarkEnd w:id="33"/>
       <w:r>
         <w:rPr>
@@ -15280,7 +15340,7 @@
         <w:spacing w:before="280" w:after="140"/>
         <w:rPr/>
       </w:pPr>
-      <w:bookmarkStart w:id="34" w:name="__RefHeading___Toc1593_740312040"/>
+      <w:bookmarkStart w:id="34" w:name="__RefHeading___Toc1655_2501354947"/>
       <w:bookmarkEnd w:id="34"/>
       <w:r>
         <w:rPr>
@@ -15430,7 +15490,7 @@
         <w:spacing w:before="280" w:after="140"/>
         <w:rPr/>
       </w:pPr>
-      <w:bookmarkStart w:id="35" w:name="__RefHeading___Toc1595_740312040"/>
+      <w:bookmarkStart w:id="35" w:name="__RefHeading___Toc1657_2501354947"/>
       <w:bookmarkEnd w:id="35"/>
       <w:r>
         <w:rPr>
@@ -15562,37 +15622,15 @@
           <w:sz w:val="26"/>
           <w:szCs w:val="26"/>
         </w:rPr>
-        <w:t>đã bấm thử bản preview</w:t>
-      </w:r>
-      <w:r>
-        <w:rPr>
-          <w:rFonts w:eastAsia="Times New Roman" w:cs="Times New Roman"/>
-          <w:sz w:val="26"/>
-          <w:szCs w:val="26"/>
-        </w:rPr>
-        <w:t xml:space="preserve"> với tính năng có giao diện.</w:t>
-      </w:r>
-      <w:r>
-        <w:br w:type="page"/>
-      </w:r>
-    </w:p>
-    <w:p>
-      <w:pPr>
-        <w:pStyle w:val="Heading1"/>
-        <w:spacing w:before="240" w:after="200"/>
-        <w:rPr/>
-      </w:pPr>
-      <w:bookmarkStart w:id="36" w:name="__RefHeading___Toc1597_740312040"/>
-      <w:bookmarkEnd w:id="36"/>
-      <w:r>
-        <w:rPr>
-          <w:rFonts w:eastAsia="Times New Roman" w:cs="Times New Roman"/>
-          <w:b/>
-          <w:bCs/>
-          <w:sz w:val="32"/>
-          <w:szCs w:val="32"/>
-        </w:rPr>
-        <w:t>PHẦN VII. PHỤ LỤC</w:t>
+        <w:t>đã chạy thử trên trình duyệt</w:t>
+      </w:r>
+      <w:r>
+        <w:rPr>
+          <w:rFonts w:eastAsia="Times New Roman" w:cs="Times New Roman"/>
+          <w:sz w:val="26"/>
+          <w:szCs w:val="26"/>
+        </w:rPr>
+        <w:t xml:space="preserve"> với tính năng có giao diện (bản preview nếu dự án còn bật, hoặc ảnh chụp Claude chạy thử).</w:t>
       </w:r>
     </w:p>
     <w:p>
@@ -15602,8 +15640,584 @@
         <w:spacing w:before="280" w:after="140"/>
         <w:rPr/>
       </w:pPr>
-      <w:bookmarkStart w:id="37" w:name="__RefHeading___Toc1599_740312040"/>
+      <w:bookmarkStart w:id="36" w:name="__RefHeading___Toc1659_2501354947"/>
+      <w:bookmarkEnd w:id="36"/>
+      <w:r>
+        <w:rPr>
+          <w:rFonts w:eastAsia="Times New Roman" w:cs="Times New Roman"/>
+          <w:b/>
+          <w:bCs/>
+          <w:sz w:val="28"/>
+          <w:szCs w:val="28"/>
+        </w:rPr>
+        <w:t>7. Kiểm soát chi phí hạ tầng</w:t>
+      </w:r>
+    </w:p>
+    <w:p>
+      <w:pPr>
+        <w:pStyle w:val="Normal"/>
+        <w:spacing w:lineRule="exact" w:line="312" w:before="60" w:after="120"/>
+        <w:jc w:val="both"/>
+        <w:rPr/>
+      </w:pPr>
+      <w:r>
+        <w:rPr>
+          <w:rFonts w:eastAsia="Times New Roman" w:cs="Times New Roman"/>
+          <w:sz w:val="26"/>
+          <w:szCs w:val="26"/>
+        </w:rPr>
+        <w:t xml:space="preserve">Mỗi lần đẩy code, nền tảng như Vercel có thể tự build một </w:t>
+      </w:r>
+      <w:r>
+        <w:rPr>
+          <w:rFonts w:eastAsia="Times New Roman" w:cs="Times New Roman"/>
+          <w:b/>
+          <w:bCs/>
+          <w:sz w:val="26"/>
+          <w:szCs w:val="26"/>
+        </w:rPr>
+        <w:t>bản xem thử (preview)</w:t>
+      </w:r>
+      <w:r>
+        <w:rPr>
+          <w:rFonts w:eastAsia="Times New Roman" w:cs="Times New Roman"/>
+          <w:sz w:val="26"/>
+          <w:szCs w:val="26"/>
+        </w:rPr>
+        <w:t>. Vibe coding đẩy code rất nhiều lần, nên dung lượng và chi phí tăng theo số bản build chứ không theo số người dùng.</w:t>
+      </w:r>
+    </w:p>
+    <w:p>
+      <w:pPr>
+        <w:pStyle w:val="ListParagraph"/>
+        <w:numPr>
+          <w:ilvl w:val="0"/>
+          <w:numId w:val="1"/>
+        </w:numPr>
+        <w:spacing w:lineRule="exact" w:line="300" w:before="30" w:after="60"/>
+        <w:rPr/>
+      </w:pPr>
+      <w:r>
+        <w:rPr>
+          <w:rFonts w:eastAsia="Times New Roman" w:cs="Times New Roman"/>
+          <w:sz w:val="26"/>
+          <w:szCs w:val="26"/>
+        </w:rPr>
+        <w:t xml:space="preserve">Định kỳ xem trang </w:t>
+      </w:r>
+      <w:r>
+        <w:rPr>
+          <w:rFonts w:eastAsia="Times New Roman" w:cs="Times New Roman"/>
+          <w:b/>
+          <w:bCs/>
+          <w:sz w:val="26"/>
+          <w:szCs w:val="26"/>
+        </w:rPr>
+        <w:t>Usage</w:t>
+      </w:r>
+      <w:r>
+        <w:rPr>
+          <w:rFonts w:eastAsia="Times New Roman" w:cs="Times New Roman"/>
+          <w:sz w:val="26"/>
+          <w:szCs w:val="26"/>
+        </w:rPr>
+        <w:t xml:space="preserve"> của nền tảng; hỏi Claude "chỉ số nào sắp chạm giới hạn và vì sao" kèm ảnh chụp.</w:t>
+      </w:r>
+    </w:p>
+    <w:p>
+      <w:pPr>
+        <w:pStyle w:val="ListParagraph"/>
+        <w:numPr>
+          <w:ilvl w:val="0"/>
+          <w:numId w:val="1"/>
+        </w:numPr>
+        <w:spacing w:lineRule="exact" w:line="300" w:before="30" w:after="60"/>
+        <w:rPr/>
+      </w:pPr>
+      <w:r>
+        <w:rPr>
+          <w:rFonts w:eastAsia="Times New Roman" w:cs="Times New Roman"/>
+          <w:sz w:val="26"/>
+          <w:szCs w:val="26"/>
+        </w:rPr>
+        <w:t xml:space="preserve">Đặt </w:t>
+      </w:r>
+      <w:r>
+        <w:rPr>
+          <w:rFonts w:eastAsia="Times New Roman" w:cs="Times New Roman"/>
+          <w:b/>
+          <w:bCs/>
+          <w:sz w:val="26"/>
+          <w:szCs w:val="26"/>
+        </w:rPr>
+        <w:t>chính sách tự xoá bản build cũ</w:t>
+      </w:r>
+      <w:r>
+        <w:rPr>
+          <w:rFonts w:eastAsia="Times New Roman" w:cs="Times New Roman"/>
+          <w:sz w:val="26"/>
+          <w:szCs w:val="26"/>
+        </w:rPr>
+        <w:t xml:space="preserve"> (VD: bản lỗi/huỷ 1 ngày, bản preview 1 tuần, production 30 ngày).</w:t>
+      </w:r>
+    </w:p>
+    <w:p>
+      <w:pPr>
+        <w:pStyle w:val="ListParagraph"/>
+        <w:numPr>
+          <w:ilvl w:val="0"/>
+          <w:numId w:val="1"/>
+        </w:numPr>
+        <w:spacing w:lineRule="exact" w:line="300" w:before="30" w:after="60"/>
+        <w:rPr/>
+      </w:pPr>
+      <w:r>
+        <w:rPr>
+          <w:rFonts w:eastAsia="Times New Roman" w:cs="Times New Roman"/>
+          <w:sz w:val="26"/>
+          <w:szCs w:val="26"/>
+        </w:rPr>
+        <w:t xml:space="preserve">Khi cần, chỉ build nhánh chính: với Vercel, khai báo trong </w:t>
+      </w:r>
+      <w:r>
+        <w:rPr>
+          <w:rFonts w:eastAsia="Courier New" w:cs="Courier New" w:ascii="Courier New" w:hAnsi="Courier New"/>
+          <w:color w:val="8A2E12"/>
+          <w:sz w:val="22"/>
+          <w:szCs w:val="22"/>
+        </w:rPr>
+        <w:t>vercel.json</w:t>
+      </w:r>
+      <w:r>
+        <w:rPr>
+          <w:rFonts w:eastAsia="Times New Roman" w:cs="Times New Roman"/>
+          <w:sz w:val="26"/>
+          <w:szCs w:val="26"/>
+        </w:rPr>
+        <w:t xml:space="preserve"> mục </w:t>
+      </w:r>
+      <w:r>
+        <w:rPr>
+          <w:rFonts w:eastAsia="Courier New" w:cs="Courier New" w:ascii="Courier New" w:hAnsi="Courier New"/>
+          <w:color w:val="8A2E12"/>
+          <w:sz w:val="22"/>
+          <w:szCs w:val="22"/>
+        </w:rPr>
+        <w:t>git.deploymentEnabled</w:t>
+      </w:r>
+      <w:r>
+        <w:rPr>
+          <w:rFonts w:eastAsia="Times New Roman" w:cs="Times New Roman"/>
+          <w:sz w:val="26"/>
+          <w:szCs w:val="26"/>
+        </w:rPr>
+        <w:t xml:space="preserve"> để tắt các nhánh làm việc. Đánh đổi: PR không còn link preview, nên phải dựa vào CI và chạy thử trên máy.</w:t>
+      </w:r>
+    </w:p>
+    <w:p>
+      <w:pPr>
+        <w:pStyle w:val="ListParagraph"/>
+        <w:numPr>
+          <w:ilvl w:val="0"/>
+          <w:numId w:val="1"/>
+        </w:numPr>
+        <w:spacing w:lineRule="exact" w:line="300" w:before="30" w:after="60"/>
+        <w:rPr/>
+      </w:pPr>
+      <w:r>
+        <w:rPr>
+          <w:rFonts w:eastAsia="Times New Roman" w:cs="Times New Roman"/>
+          <w:sz w:val="26"/>
+          <w:szCs w:val="26"/>
+        </w:rPr>
+        <w:t xml:space="preserve">Yêu cầu Claude </w:t>
+      </w:r>
+      <w:r>
+        <w:rPr>
+          <w:rFonts w:eastAsia="Times New Roman" w:cs="Times New Roman"/>
+          <w:b/>
+          <w:bCs/>
+          <w:sz w:val="26"/>
+          <w:szCs w:val="26"/>
+        </w:rPr>
+        <w:t>xác minh sau khi đổi cấu hình</w:t>
+      </w:r>
+      <w:r>
+        <w:rPr>
+          <w:rFonts w:eastAsia="Times New Roman" w:cs="Times New Roman"/>
+          <w:sz w:val="26"/>
+          <w:szCs w:val="26"/>
+        </w:rPr>
+        <w:t xml:space="preserve"> (VD: commit mới không còn tạo deployment), đừng chỉ tin là đã có tác dụng - lần thử đầu tiên có thể không chạy.</w:t>
+      </w:r>
+    </w:p>
+    <w:p>
+      <w:pPr>
+        <w:pStyle w:val="Heading2"/>
+        <w:keepNext w:val="true"/>
+        <w:spacing w:before="280" w:after="140"/>
+        <w:rPr/>
+      </w:pPr>
+      <w:bookmarkStart w:id="37" w:name="__RefHeading___Toc1661_2501354947"/>
       <w:bookmarkEnd w:id="37"/>
+      <w:r>
+        <w:rPr>
+          <w:rFonts w:eastAsia="Times New Roman" w:cs="Times New Roman"/>
+          <w:b/>
+          <w:bCs/>
+          <w:sz w:val="28"/>
+          <w:szCs w:val="28"/>
+        </w:rPr>
+        <w:t>8. Kiểm chứng kết quả, không chỉ đọc báo cáo</w:t>
+      </w:r>
+    </w:p>
+    <w:p>
+      <w:pPr>
+        <w:pStyle w:val="ListParagraph"/>
+        <w:numPr>
+          <w:ilvl w:val="0"/>
+          <w:numId w:val="1"/>
+        </w:numPr>
+        <w:spacing w:lineRule="exact" w:line="300" w:before="30" w:after="60"/>
+        <w:rPr/>
+      </w:pPr>
+      <w:r>
+        <w:rPr>
+          <w:rFonts w:eastAsia="Times New Roman" w:cs="Times New Roman"/>
+          <w:sz w:val="26"/>
+          <w:szCs w:val="26"/>
+        </w:rPr>
+        <w:t xml:space="preserve">Test chạy trên </w:t>
+      </w:r>
+      <w:r>
+        <w:rPr>
+          <w:rFonts w:eastAsia="Times New Roman" w:cs="Times New Roman"/>
+          <w:b/>
+          <w:bCs/>
+          <w:sz w:val="26"/>
+          <w:szCs w:val="26"/>
+        </w:rPr>
+        <w:t>bản build có sẵn</w:t>
+      </w:r>
+      <w:r>
+        <w:rPr>
+          <w:rFonts w:eastAsia="Times New Roman" w:cs="Times New Roman"/>
+          <w:sz w:val="26"/>
+          <w:szCs w:val="26"/>
+        </w:rPr>
+        <w:t xml:space="preserve"> sẽ báo "đạt" cho code cũ. Yêu cầu Claude build lại trước khi chạy test tích hợp và ghi rõ đã build.</w:t>
+      </w:r>
+    </w:p>
+    <w:p>
+      <w:pPr>
+        <w:pStyle w:val="ListParagraph"/>
+        <w:numPr>
+          <w:ilvl w:val="0"/>
+          <w:numId w:val="1"/>
+        </w:numPr>
+        <w:spacing w:lineRule="exact" w:line="300" w:before="30" w:after="60"/>
+        <w:rPr/>
+      </w:pPr>
+      <w:r>
+        <w:rPr>
+          <w:rFonts w:eastAsia="Times New Roman" w:cs="Times New Roman"/>
+          <w:sz w:val="26"/>
+          <w:szCs w:val="26"/>
+        </w:rPr>
+        <w:t xml:space="preserve">Với lỗi giao diện, yêu cầu Claude </w:t>
+      </w:r>
+      <w:r>
+        <w:rPr>
+          <w:rFonts w:eastAsia="Times New Roman" w:cs="Times New Roman"/>
+          <w:b/>
+          <w:bCs/>
+          <w:sz w:val="26"/>
+          <w:szCs w:val="26"/>
+        </w:rPr>
+        <w:t>mở trình duyệt thật và chụp ảnh</w:t>
+      </w:r>
+      <w:r>
+        <w:rPr>
+          <w:rFonts w:eastAsia="Times New Roman" w:cs="Times New Roman"/>
+          <w:sz w:val="26"/>
+          <w:szCs w:val="26"/>
+        </w:rPr>
+        <w:t xml:space="preserve"> trước và sau khi sửa (VD: kéo ngang bảng 600px, tên nhóm vẫn hiện).</w:t>
+      </w:r>
+    </w:p>
+    <w:p>
+      <w:pPr>
+        <w:pStyle w:val="ListParagraph"/>
+        <w:numPr>
+          <w:ilvl w:val="0"/>
+          <w:numId w:val="1"/>
+        </w:numPr>
+        <w:spacing w:lineRule="exact" w:line="300" w:before="30" w:after="60"/>
+        <w:rPr/>
+      </w:pPr>
+      <w:r>
+        <w:rPr>
+          <w:rFonts w:eastAsia="Times New Roman" w:cs="Times New Roman"/>
+          <w:sz w:val="26"/>
+          <w:szCs w:val="26"/>
+        </w:rPr>
+        <w:t xml:space="preserve">Khi báo lỗi từ dịch vụ ngoài (VD "AI đang quá tải"), gửi cả phần </w:t>
+      </w:r>
+      <w:r>
+        <w:rPr>
+          <w:rFonts w:eastAsia="Times New Roman" w:cs="Times New Roman"/>
+          <w:b/>
+          <w:bCs/>
+          <w:sz w:val="26"/>
+          <w:szCs w:val="26"/>
+        </w:rPr>
+        <w:t>Chi tiết kỹ thuật</w:t>
+      </w:r>
+      <w:r>
+        <w:rPr>
+          <w:rFonts w:eastAsia="Times New Roman" w:cs="Times New Roman"/>
+          <w:sz w:val="26"/>
+          <w:szCs w:val="26"/>
+        </w:rPr>
+        <w:t xml:space="preserve"> và kết quả nút </w:t>
+      </w:r>
+      <w:r>
+        <w:rPr>
+          <w:rFonts w:eastAsia="Times New Roman" w:cs="Times New Roman"/>
+          <w:b/>
+          <w:bCs/>
+          <w:sz w:val="26"/>
+          <w:szCs w:val="26"/>
+        </w:rPr>
+        <w:t>Kiểm tra kết nối</w:t>
+      </w:r>
+      <w:r>
+        <w:rPr>
+          <w:rFonts w:eastAsia="Times New Roman" w:cs="Times New Roman"/>
+          <w:sz w:val="26"/>
+          <w:szCs w:val="26"/>
+        </w:rPr>
+        <w:t xml:space="preserve"> để phân biệt lỗi của dịch vụ với lỗi của app.</w:t>
+      </w:r>
+    </w:p>
+    <w:p>
+      <w:pPr>
+        <w:pStyle w:val="ListParagraph"/>
+        <w:numPr>
+          <w:ilvl w:val="0"/>
+          <w:numId w:val="1"/>
+        </w:numPr>
+        <w:spacing w:lineRule="exact" w:line="300" w:before="30" w:after="60"/>
+        <w:rPr/>
+      </w:pPr>
+      <w:r>
+        <w:rPr>
+          <w:rFonts w:eastAsia="Times New Roman" w:cs="Times New Roman"/>
+          <w:sz w:val="26"/>
+          <w:szCs w:val="26"/>
+        </w:rPr>
+        <w:t xml:space="preserve">Dữ liệu production chỉ dùng để </w:t>
+      </w:r>
+      <w:r>
+        <w:rPr>
+          <w:rFonts w:eastAsia="Times New Roman" w:cs="Times New Roman"/>
+          <w:b/>
+          <w:bCs/>
+          <w:sz w:val="26"/>
+          <w:szCs w:val="26"/>
+        </w:rPr>
+        <w:t>đọc khi chẩn đoán</w:t>
+      </w:r>
+      <w:r>
+        <w:rPr>
+          <w:rFonts w:eastAsia="Times New Roman" w:cs="Times New Roman"/>
+          <w:sz w:val="26"/>
+          <w:szCs w:val="26"/>
+        </w:rPr>
+        <w:t xml:space="preserve"> (VD: đếm số bình luận, độ dài trung bình) - không sửa, không xoá.</w:t>
+      </w:r>
+    </w:p>
+    <w:p>
+      <w:pPr>
+        <w:pStyle w:val="Heading2"/>
+        <w:keepNext w:val="true"/>
+        <w:spacing w:before="280" w:after="140"/>
+        <w:rPr/>
+      </w:pPr>
+      <w:bookmarkStart w:id="38" w:name="__RefHeading___Toc1663_2501354947"/>
+      <w:bookmarkEnd w:id="38"/>
+      <w:r>
+        <w:rPr>
+          <w:rFonts w:eastAsia="Times New Roman" w:cs="Times New Roman"/>
+          <w:b/>
+          <w:bCs/>
+          <w:sz w:val="28"/>
+          <w:szCs w:val="28"/>
+        </w:rPr>
+        <w:t>9. Làm cho câu trả lời AI kiểm chứng được</w:t>
+      </w:r>
+    </w:p>
+    <w:p>
+      <w:pPr>
+        <w:pStyle w:val="ListParagraph"/>
+        <w:numPr>
+          <w:ilvl w:val="0"/>
+          <w:numId w:val="1"/>
+        </w:numPr>
+        <w:spacing w:lineRule="exact" w:line="300" w:before="30" w:after="60"/>
+        <w:rPr/>
+      </w:pPr>
+      <w:r>
+        <w:rPr>
+          <w:rFonts w:eastAsia="Times New Roman" w:cs="Times New Roman"/>
+          <w:sz w:val="26"/>
+          <w:szCs w:val="26"/>
+        </w:rPr>
+        <w:t xml:space="preserve">Yêu cầu AI trong app </w:t>
+      </w:r>
+      <w:r>
+        <w:rPr>
+          <w:rFonts w:eastAsia="Times New Roman" w:cs="Times New Roman"/>
+          <w:b/>
+          <w:bCs/>
+          <w:sz w:val="26"/>
+          <w:szCs w:val="26"/>
+        </w:rPr>
+        <w:t>trích dẫn nguồn</w:t>
+      </w:r>
+      <w:r>
+        <w:rPr>
+          <w:rFonts w:eastAsia="Times New Roman" w:cs="Times New Roman"/>
+          <w:sz w:val="26"/>
+          <w:szCs w:val="26"/>
+        </w:rPr>
+        <w:t xml:space="preserve"> cho từng nhận định và để app tự đổi mã nguồn thành link - người đọc bấm vào là thấy dữ liệu gốc.</w:t>
+      </w:r>
+    </w:p>
+    <w:p>
+      <w:pPr>
+        <w:pStyle w:val="ListParagraph"/>
+        <w:numPr>
+          <w:ilvl w:val="0"/>
+          <w:numId w:val="1"/>
+        </w:numPr>
+        <w:spacing w:lineRule="exact" w:line="300" w:before="30" w:after="60"/>
+        <w:rPr/>
+      </w:pPr>
+      <w:r>
+        <w:rPr>
+          <w:rFonts w:eastAsia="Times New Roman" w:cs="Times New Roman"/>
+          <w:sz w:val="26"/>
+          <w:szCs w:val="26"/>
+        </w:rPr>
+        <w:t>App chỉ tạo link cho mã có thật trong dữ liệu; mã AI tự bịa bị bỏ, nên AI không thể dẫn người dùng tới nơi không tồn tại.</w:t>
+      </w:r>
+    </w:p>
+    <w:p>
+      <w:pPr>
+        <w:pStyle w:val="ListParagraph"/>
+        <w:numPr>
+          <w:ilvl w:val="0"/>
+          <w:numId w:val="1"/>
+        </w:numPr>
+        <w:spacing w:lineRule="exact" w:line="300" w:before="30" w:after="60"/>
+        <w:rPr/>
+      </w:pPr>
+      <w:r>
+        <w:rPr>
+          <w:rFonts w:eastAsia="Times New Roman" w:cs="Times New Roman"/>
+          <w:sz w:val="26"/>
+          <w:szCs w:val="26"/>
+        </w:rPr>
+        <w:t xml:space="preserve">Kiểm tra AI có </w:t>
+      </w:r>
+      <w:r>
+        <w:rPr>
+          <w:rFonts w:eastAsia="Times New Roman" w:cs="Times New Roman"/>
+          <w:b/>
+          <w:bCs/>
+          <w:sz w:val="26"/>
+          <w:szCs w:val="26"/>
+        </w:rPr>
+        <w:t>đọc đủ dữ liệu</w:t>
+      </w:r>
+      <w:r>
+        <w:rPr>
+          <w:rFonts w:eastAsia="Times New Roman" w:cs="Times New Roman"/>
+          <w:sz w:val="26"/>
+          <w:szCs w:val="26"/>
+        </w:rPr>
+        <w:t xml:space="preserve"> không (VD bình luận dài bị cắt ở 400 ký tự là một lỗi khó thấy) bằng cách hỏi một câu mà câu trả lời nằm ở cuối bình luận dài.</w:t>
+      </w:r>
+    </w:p>
+    <w:p>
+      <w:pPr>
+        <w:pStyle w:val="ListParagraph"/>
+        <w:numPr>
+          <w:ilvl w:val="0"/>
+          <w:numId w:val="1"/>
+        </w:numPr>
+        <w:spacing w:lineRule="exact" w:line="300" w:before="30" w:after="60"/>
+        <w:rPr/>
+      </w:pPr>
+      <w:r>
+        <w:rPr>
+          <w:rFonts w:eastAsia="Times New Roman" w:cs="Times New Roman"/>
+          <w:sz w:val="26"/>
+          <w:szCs w:val="26"/>
+        </w:rPr>
+        <w:t xml:space="preserve">Thêm </w:t>
+      </w:r>
+      <w:r>
+        <w:rPr>
+          <w:rFonts w:eastAsia="Times New Roman" w:cs="Times New Roman"/>
+          <w:b/>
+          <w:bCs/>
+          <w:sz w:val="26"/>
+          <w:szCs w:val="26"/>
+        </w:rPr>
+        <w:t>trợ giúp ngay trong app</w:t>
+      </w:r>
+      <w:r>
+        <w:rPr>
+          <w:rFonts w:eastAsia="Times New Roman" w:cs="Times New Roman"/>
+          <w:sz w:val="26"/>
+          <w:szCs w:val="26"/>
+        </w:rPr>
+        <w:t xml:space="preserve"> (một mục Help trên menu) và giữ nó cùng nhịp cập nhật với tài liệu Word/PPTX.</w:t>
+      </w:r>
+      <w:r>
+        <w:br w:type="page"/>
+      </w:r>
+    </w:p>
+    <w:p>
+      <w:pPr>
+        <w:pStyle w:val="Heading1"/>
+        <w:spacing w:before="240" w:after="200"/>
+        <w:rPr/>
+      </w:pPr>
+      <w:bookmarkStart w:id="39" w:name="__RefHeading___Toc1665_2501354947"/>
+      <w:bookmarkEnd w:id="39"/>
+      <w:r>
+        <w:rPr>
+          <w:rFonts w:eastAsia="Times New Roman" w:cs="Times New Roman"/>
+          <w:b/>
+          <w:bCs/>
+          <w:sz w:val="32"/>
+          <w:szCs w:val="32"/>
+        </w:rPr>
+        <w:t>PHẦN VII. PHỤ LỤC</w:t>
+      </w:r>
+    </w:p>
+    <w:p>
+      <w:pPr>
+        <w:pStyle w:val="Heading2"/>
+        <w:keepNext w:val="true"/>
+        <w:spacing w:before="280" w:after="140"/>
+        <w:rPr/>
+      </w:pPr>
+      <w:bookmarkStart w:id="40" w:name="__RefHeading___Toc1667_2501354947"/>
+      <w:bookmarkEnd w:id="40"/>
       <w:r>
         <w:rPr>
           <w:rFonts w:eastAsia="Times New Roman" w:cs="Times New Roman"/>
@@ -16421,6 +17035,180 @@
           </w:p>
         </w:tc>
       </w:tr>
+      <w:tr>
+        <w:trPr/>
+        <w:tc>
+          <w:tcPr>
+            <w:tcW w:w="544" w:type="dxa"/>
+            <w:tcBorders>
+              <w:top w:val="single" w:sz="4" w:space="0" w:color="BFBFBF"/>
+              <w:left w:val="single" w:sz="4" w:space="0" w:color="BFBFBF"/>
+              <w:bottom w:val="single" w:sz="4" w:space="0" w:color="BFBFBF"/>
+              <w:right w:val="single" w:sz="4" w:space="0" w:color="BFBFBF"/>
+            </w:tcBorders>
+          </w:tcPr>
+          <w:p>
+            <w:pPr>
+              <w:pStyle w:val="Normal"/>
+              <w:spacing w:lineRule="exact" w:line="276" w:before="0" w:after="40"/>
+              <w:rPr/>
+            </w:pPr>
+            <w:r>
+              <w:rPr>
+                <w:rFonts w:eastAsia="Times New Roman" w:cs="Times New Roman"/>
+                <w:b w:val="false"/>
+                <w:bCs w:val="false"/>
+                <w:sz w:val="23"/>
+                <w:szCs w:val="23"/>
+              </w:rPr>
+              <w:t>9</w:t>
+            </w:r>
+          </w:p>
+        </w:tc>
+        <w:tc>
+          <w:tcPr>
+            <w:tcW w:w="7437" w:type="dxa"/>
+            <w:tcBorders>
+              <w:top w:val="single" w:sz="4" w:space="0" w:color="BFBFBF"/>
+              <w:left w:val="single" w:sz="4" w:space="0" w:color="BFBFBF"/>
+              <w:bottom w:val="single" w:sz="4" w:space="0" w:color="BFBFBF"/>
+              <w:right w:val="single" w:sz="4" w:space="0" w:color="BFBFBF"/>
+            </w:tcBorders>
+          </w:tcPr>
+          <w:p>
+            <w:pPr>
+              <w:pStyle w:val="Normal"/>
+              <w:spacing w:lineRule="exact" w:line="276" w:before="0" w:after="40"/>
+              <w:rPr/>
+            </w:pPr>
+            <w:r>
+              <w:rPr>
+                <w:rFonts w:eastAsia="Times New Roman" w:cs="Times New Roman"/>
+                <w:b w:val="false"/>
+                <w:bCs w:val="false"/>
+                <w:sz w:val="23"/>
+                <w:szCs w:val="23"/>
+              </w:rPr>
+              <w:t>Test tích hợp chạy trên bản build mới nhất (đã build lại trước khi test)</w:t>
+            </w:r>
+          </w:p>
+        </w:tc>
+        <w:tc>
+          <w:tcPr>
+            <w:tcW w:w="1090" w:type="dxa"/>
+            <w:tcBorders>
+              <w:top w:val="single" w:sz="4" w:space="0" w:color="BFBFBF"/>
+              <w:left w:val="single" w:sz="4" w:space="0" w:color="BFBFBF"/>
+              <w:bottom w:val="single" w:sz="4" w:space="0" w:color="BFBFBF"/>
+              <w:right w:val="single" w:sz="4" w:space="0" w:color="BFBFBF"/>
+            </w:tcBorders>
+          </w:tcPr>
+          <w:p>
+            <w:pPr>
+              <w:pStyle w:val="Normal"/>
+              <w:spacing w:lineRule="exact" w:line="276" w:before="0" w:after="40"/>
+              <w:rPr/>
+            </w:pPr>
+            <w:r>
+              <w:rPr>
+                <w:rFonts w:eastAsia="Times New Roman" w:cs="Times New Roman"/>
+                <w:b w:val="false"/>
+                <w:bCs w:val="false"/>
+                <w:sz w:val="23"/>
+                <w:szCs w:val="23"/>
+              </w:rPr>
+              <w:t>☐</w:t>
+            </w:r>
+          </w:p>
+        </w:tc>
+      </w:tr>
+      <w:tr>
+        <w:trPr/>
+        <w:tc>
+          <w:tcPr>
+            <w:tcW w:w="544" w:type="dxa"/>
+            <w:tcBorders>
+              <w:top w:val="single" w:sz="4" w:space="0" w:color="BFBFBF"/>
+              <w:left w:val="single" w:sz="4" w:space="0" w:color="BFBFBF"/>
+              <w:bottom w:val="single" w:sz="4" w:space="0" w:color="BFBFBF"/>
+              <w:right w:val="single" w:sz="4" w:space="0" w:color="BFBFBF"/>
+            </w:tcBorders>
+          </w:tcPr>
+          <w:p>
+            <w:pPr>
+              <w:pStyle w:val="Normal"/>
+              <w:spacing w:lineRule="exact" w:line="276" w:before="0" w:after="40"/>
+              <w:rPr/>
+            </w:pPr>
+            <w:r>
+              <w:rPr>
+                <w:rFonts w:eastAsia="Times New Roman" w:cs="Times New Roman"/>
+                <w:b w:val="false"/>
+                <w:bCs w:val="false"/>
+                <w:sz w:val="23"/>
+                <w:szCs w:val="23"/>
+              </w:rPr>
+              <w:t>10</w:t>
+            </w:r>
+          </w:p>
+        </w:tc>
+        <w:tc>
+          <w:tcPr>
+            <w:tcW w:w="7437" w:type="dxa"/>
+            <w:tcBorders>
+              <w:top w:val="single" w:sz="4" w:space="0" w:color="BFBFBF"/>
+              <w:left w:val="single" w:sz="4" w:space="0" w:color="BFBFBF"/>
+              <w:bottom w:val="single" w:sz="4" w:space="0" w:color="BFBFBF"/>
+              <w:right w:val="single" w:sz="4" w:space="0" w:color="BFBFBF"/>
+            </w:tcBorders>
+          </w:tcPr>
+          <w:p>
+            <w:pPr>
+              <w:pStyle w:val="Normal"/>
+              <w:spacing w:lineRule="exact" w:line="276" w:before="0" w:after="40"/>
+              <w:rPr/>
+            </w:pPr>
+            <w:r>
+              <w:rPr>
+                <w:rFonts w:eastAsia="Times New Roman" w:cs="Times New Roman"/>
+                <w:b w:val="false"/>
+                <w:bCs w:val="false"/>
+                <w:sz w:val="23"/>
+                <w:szCs w:val="23"/>
+              </w:rPr>
+              <w:t>Đã cập nhật trợ giúp trong app và 4 tài liệu (As-Built, hướng dẫn Word/PPTX, quy trình này)</w:t>
+            </w:r>
+          </w:p>
+        </w:tc>
+        <w:tc>
+          <w:tcPr>
+            <w:tcW w:w="1090" w:type="dxa"/>
+            <w:tcBorders>
+              <w:top w:val="single" w:sz="4" w:space="0" w:color="BFBFBF"/>
+              <w:left w:val="single" w:sz="4" w:space="0" w:color="BFBFBF"/>
+              <w:bottom w:val="single" w:sz="4" w:space="0" w:color="BFBFBF"/>
+              <w:right w:val="single" w:sz="4" w:space="0" w:color="BFBFBF"/>
+            </w:tcBorders>
+          </w:tcPr>
+          <w:p>
+            <w:pPr>
+              <w:pStyle w:val="Normal"/>
+              <w:spacing w:lineRule="exact" w:line="276" w:before="0" w:after="40"/>
+              <w:rPr/>
+            </w:pPr>
+            <w:r>
+              <w:rPr>
+                <w:rFonts w:eastAsia="Times New Roman" w:cs="Times New Roman"/>
+                <w:b w:val="false"/>
+                <w:bCs w:val="false"/>
+                <w:sz w:val="23"/>
+                <w:szCs w:val="23"/>
+              </w:rPr>
+              <w:t>☐</w:t>
+            </w:r>
+          </w:p>
+        </w:tc>
+      </w:tr>
     </w:tbl>
     <w:p>
       <w:pPr>
@@ -16439,8 +17227,8 @@
         <w:spacing w:before="280" w:after="140"/>
         <w:rPr/>
       </w:pPr>
-      <w:bookmarkStart w:id="38" w:name="__RefHeading___Toc1601_740312040"/>
-      <w:bookmarkEnd w:id="38"/>
+      <w:bookmarkStart w:id="41" w:name="__RefHeading___Toc1669_2501354947"/>
+      <w:bookmarkEnd w:id="41"/>
       <w:r>
         <w:rPr>
           <w:rFonts w:eastAsia="Times New Roman" w:cs="Times New Roman"/>
@@ -16898,8 +17686,8 @@
         <w:spacing w:before="280" w:after="140"/>
         <w:rPr/>
       </w:pPr>
-      <w:bookmarkStart w:id="39" w:name="__RefHeading___Toc1603_740312040"/>
-      <w:bookmarkEnd w:id="39"/>
+      <w:bookmarkStart w:id="42" w:name="__RefHeading___Toc1671_2501354947"/>
+      <w:bookmarkEnd w:id="42"/>
       <w:r>
         <w:rPr>
           <w:rFonts w:eastAsia="Times New Roman" w:cs="Times New Roman"/>
@@ -17717,8 +18505,8 @@
         <w:spacing w:before="280" w:after="140"/>
         <w:rPr/>
       </w:pPr>
-      <w:bookmarkStart w:id="40" w:name="__RefHeading___Toc1605_740312040"/>
-      <w:bookmarkEnd w:id="40"/>
+      <w:bookmarkStart w:id="43" w:name="__RefHeading___Toc1673_2501354947"/>
+      <w:bookmarkEnd w:id="43"/>
       <w:r>
         <w:rPr>
           <w:rFonts w:eastAsia="Times New Roman" w:cs="Times New Roman"/>
@@ -17861,7 +18649,7 @@
     </w:r>
     <w:r>
       <w:rPr/>
-      <w:t>24</w:t>
+      <w:t>26</w:t>
     </w:r>
     <w:r>
       <w:rPr/>
@@ -18507,9 +19295,7 @@
     <w:basedOn w:val="Normal"/>
     <w:next w:val="Normal"/>
     <w:qFormat/>
-    <w:pPr>
-      <w:outlineLvl w:val="2"/>
-    </w:pPr>
+    <w:pPr/>
     <w:rPr>
       <w:color w:val="1F4D78"/>
       <w:sz w:val="24"/>

</xml_diff>